<commit_message>
Codify cross-unit dispatch safety rules
</commit_message>
<xml_diff>
--- a/提交材料/02_整体解决方案书.docx
+++ b/提交材料/02_整体解决方案书.docx
@@ -1515,7 +1515,382 @@
         <w:pStyle w:val="Heading1"/>
       </w:pPr>
       <w:r>
-        <w:t>6. 30/60/90天落地路径</w:t>
+        <w:t>6. 跨装置联动的调度优先级</w:t>
+      </w:r>
+    </w:p>
+    <w:p>
+      <w:r>
+        <w:rPr>
+          <w:rFonts w:ascii="Calibri" w:hAnsi="Calibri" w:eastAsia="Microsoft YaHei"/>
+        </w:rPr>
+        <w:t>企业导师补充的关键现场经验是：合成氨调度不能只看当班利润，必须先保安全，再保流程连续，只有在流程确实需要中断时才进入特殊取舍。DCS可以完成液位、阀门、局部顺控和联锁保护，但难以自动判断下游异常、气区设备、能源窗口和产品结构变化后的跨大单元联动，因此本方案把这部分做成AI调控师的规则层。</w:t>
+      </w:r>
+    </w:p>
+    <w:tbl>
+      <w:tblPr>
+        <w:tblStyle w:val="TableGrid"/>
+        <w:tblW w:type="auto" w:w="0"/>
+        <w:jc w:val="center"/>
+        <w:tblLayout w:type="fixed"/>
+        <w:tblLook w:firstColumn="1" w:firstRow="1" w:lastColumn="0" w:lastRow="0" w:noHBand="0" w:noVBand="1" w:val="04A0"/>
+      </w:tblPr>
+      <w:tblGrid>
+        <w:gridCol w:w="2441"/>
+        <w:gridCol w:w="2441"/>
+        <w:gridCol w:w="2441"/>
+        <w:gridCol w:w="2441"/>
+      </w:tblGrid>
+      <w:tr>
+        <w:tc>
+          <w:tcPr>
+            <w:tcW w:type="dxa" w:w="1296"/>
+            <w:shd w:fill="EAF2F8"/>
+            <w:tcMar>
+              <w:top w:w="90" w:type="dxa"/>
+              <w:start w:w="120" w:type="dxa"/>
+              <w:bottom w:w="90" w:type="dxa"/>
+              <w:end w:w="120" w:type="dxa"/>
+            </w:tcMar>
+          </w:tcPr>
+          <w:p>
+            <w:r>
+              <w:rPr>
+                <w:rFonts w:ascii="Calibri" w:hAnsi="Calibri" w:eastAsia="Microsoft YaHei"/>
+                <w:b/>
+              </w:rPr>
+              <w:t>优先级</w:t>
+            </w:r>
+          </w:p>
+        </w:tc>
+        <w:tc>
+          <w:tcPr>
+            <w:tcW w:type="dxa" w:w="2880"/>
+            <w:shd w:fill="EAF2F8"/>
+            <w:tcMar>
+              <w:top w:w="90" w:type="dxa"/>
+              <w:start w:w="120" w:type="dxa"/>
+              <w:bottom w:w="90" w:type="dxa"/>
+              <w:end w:w="120" w:type="dxa"/>
+            </w:tcMar>
+          </w:tcPr>
+          <w:p>
+            <w:r>
+              <w:rPr>
+                <w:rFonts w:ascii="Calibri" w:hAnsi="Calibri" w:eastAsia="Microsoft YaHei"/>
+                <w:b/>
+              </w:rPr>
+              <w:t>判断口径</w:t>
+            </w:r>
+          </w:p>
+        </w:tc>
+        <w:tc>
+          <w:tcPr>
+            <w:tcW w:type="dxa" w:w="3384"/>
+            <w:shd w:fill="EAF2F8"/>
+            <w:tcMar>
+              <w:top w:w="90" w:type="dxa"/>
+              <w:start w:w="120" w:type="dxa"/>
+              <w:bottom w:w="90" w:type="dxa"/>
+              <w:end w:w="120" w:type="dxa"/>
+            </w:tcMar>
+          </w:tcPr>
+          <w:p>
+            <w:r>
+              <w:rPr>
+                <w:rFonts w:ascii="Calibri" w:hAnsi="Calibri" w:eastAsia="Microsoft YaHei"/>
+                <w:b/>
+              </w:rPr>
+              <w:t>调控师动作</w:t>
+            </w:r>
+          </w:p>
+        </w:tc>
+        <w:tc>
+          <w:tcPr>
+            <w:tcW w:type="dxa" w:w="1800"/>
+            <w:shd w:fill="EAF2F8"/>
+            <w:tcMar>
+              <w:top w:w="90" w:type="dxa"/>
+              <w:start w:w="120" w:type="dxa"/>
+              <w:bottom w:w="90" w:type="dxa"/>
+              <w:end w:w="120" w:type="dxa"/>
+            </w:tcMar>
+          </w:tcPr>
+          <w:p>
+            <w:r>
+              <w:rPr>
+                <w:rFonts w:ascii="Calibri" w:hAnsi="Calibri" w:eastAsia="Microsoft YaHei"/>
+                <w:b/>
+              </w:rPr>
+              <w:t>留痕与边界</w:t>
+            </w:r>
+          </w:p>
+        </w:tc>
+      </w:tr>
+      <w:tr>
+        <w:tc>
+          <w:tcPr>
+            <w:tcW w:type="dxa" w:w="1296"/>
+            <w:vAlign w:val="center"/>
+            <w:tcMar>
+              <w:top w:w="90" w:type="dxa"/>
+              <w:start w:w="120" w:type="dxa"/>
+              <w:bottom w:w="90" w:type="dxa"/>
+              <w:end w:w="120" w:type="dxa"/>
+            </w:tcMar>
+          </w:tcPr>
+          <w:p>
+            <w:r>
+              <w:rPr>
+                <w:rFonts w:ascii="Calibri" w:hAnsi="Calibri" w:eastAsia="Microsoft YaHei"/>
+                <w:sz w:val="18"/>
+              </w:rPr>
+              <w:t>1. 安全</w:t>
+            </w:r>
+          </w:p>
+        </w:tc>
+        <w:tc>
+          <w:tcPr>
+            <w:tcW w:type="dxa" w:w="2880"/>
+            <w:vAlign w:val="center"/>
+            <w:tcMar>
+              <w:top w:w="90" w:type="dxa"/>
+              <w:start w:w="120" w:type="dxa"/>
+              <w:bottom w:w="90" w:type="dxa"/>
+              <w:end w:w="120" w:type="dxa"/>
+            </w:tcMar>
+          </w:tcPr>
+          <w:p>
+            <w:r>
+              <w:rPr>
+                <w:rFonts w:ascii="Calibri" w:hAnsi="Calibri" w:eastAsia="Microsoft YaHei"/>
+                <w:sz w:val="18"/>
+              </w:rPr>
+              <w:t>安环红线、SIS/DCS联锁、罐区压力、压缩机/合成塔风险接近阈值。</w:t>
+            </w:r>
+          </w:p>
+        </w:tc>
+        <w:tc>
+          <w:tcPr>
+            <w:tcW w:type="dxa" w:w="3384"/>
+            <w:vAlign w:val="center"/>
+            <w:tcMar>
+              <w:top w:w="90" w:type="dxa"/>
+              <w:start w:w="120" w:type="dxa"/>
+              <w:bottom w:w="90" w:type="dxa"/>
+              <w:end w:w="120" w:type="dxa"/>
+            </w:tcMar>
+          </w:tcPr>
+          <w:p>
+            <w:r>
+              <w:rPr>
+                <w:rFonts w:ascii="Calibri" w:hAnsi="Calibri" w:eastAsia="Microsoft YaHei"/>
+                <w:sz w:val="18"/>
+              </w:rPr>
+              <w:t>冻结增产和高收益方案，只保留降风险、稳流程、人工确认动作。</w:t>
+            </w:r>
+          </w:p>
+        </w:tc>
+        <w:tc>
+          <w:tcPr>
+            <w:tcW w:type="dxa" w:w="1800"/>
+            <w:vAlign w:val="center"/>
+            <w:tcMar>
+              <w:top w:w="90" w:type="dxa"/>
+              <w:start w:w="120" w:type="dxa"/>
+              <w:bottom w:w="90" w:type="dxa"/>
+              <w:end w:w="120" w:type="dxa"/>
+            </w:tcMar>
+          </w:tcPr>
+          <w:p>
+            <w:r>
+              <w:rPr>
+                <w:rFonts w:ascii="Calibri" w:hAnsi="Calibri" w:eastAsia="Microsoft YaHei"/>
+                <w:sz w:val="18"/>
+              </w:rPr>
+              <w:t>不绕过DCS/SIS；触发原因进入审批和班后复盘。</w:t>
+            </w:r>
+          </w:p>
+        </w:tc>
+      </w:tr>
+      <w:tr>
+        <w:tc>
+          <w:tcPr>
+            <w:tcW w:type="dxa" w:w="1296"/>
+            <w:vAlign w:val="center"/>
+            <w:tcMar>
+              <w:top w:w="90" w:type="dxa"/>
+              <w:start w:w="120" w:type="dxa"/>
+              <w:bottom w:w="90" w:type="dxa"/>
+              <w:end w:w="120" w:type="dxa"/>
+            </w:tcMar>
+          </w:tcPr>
+          <w:p>
+            <w:r>
+              <w:rPr>
+                <w:rFonts w:ascii="Calibri" w:hAnsi="Calibri" w:eastAsia="Microsoft YaHei"/>
+                <w:sz w:val="18"/>
+              </w:rPr>
+              <w:t>2. 流程不中断</w:t>
+            </w:r>
+          </w:p>
+        </w:tc>
+        <w:tc>
+          <w:tcPr>
+            <w:tcW w:type="dxa" w:w="2880"/>
+            <w:vAlign w:val="center"/>
+            <w:tcMar>
+              <w:top w:w="90" w:type="dxa"/>
+              <w:start w:w="120" w:type="dxa"/>
+              <w:bottom w:w="90" w:type="dxa"/>
+              <w:end w:w="120" w:type="dxa"/>
+            </w:tcMar>
+          </w:tcPr>
+          <w:p>
+            <w:r>
+              <w:rPr>
+                <w:rFonts w:ascii="Calibri" w:hAnsi="Calibri" w:eastAsia="Microsoft YaHei"/>
+                <w:sz w:val="18"/>
+              </w:rPr>
+              <w:t>气化、净化、合成、空分、气轮机驱动系统和液氨去向的连续性。</w:t>
+            </w:r>
+          </w:p>
+        </w:tc>
+        <w:tc>
+          <w:tcPr>
+            <w:tcW w:type="dxa" w:w="3384"/>
+            <w:vAlign w:val="center"/>
+            <w:tcMar>
+              <w:top w:w="90" w:type="dxa"/>
+              <w:start w:w="120" w:type="dxa"/>
+              <w:bottom w:w="90" w:type="dxa"/>
+              <w:end w:w="120" w:type="dxa"/>
+            </w:tcMar>
+          </w:tcPr>
+          <w:p>
+            <w:r>
+              <w:rPr>
+                <w:rFonts w:ascii="Calibri" w:hAnsi="Calibri" w:eastAsia="Microsoft YaHei"/>
+                <w:sz w:val="18"/>
+              </w:rPr>
+              <w:t>优先做跨装置负荷联动，减少停车后重启时间、废料、人员和物料损失。</w:t>
+            </w:r>
+          </w:p>
+        </w:tc>
+        <w:tc>
+          <w:tcPr>
+            <w:tcW w:type="dxa" w:w="1800"/>
+            <w:vAlign w:val="center"/>
+            <w:tcMar>
+              <w:top w:w="90" w:type="dxa"/>
+              <w:start w:w="120" w:type="dxa"/>
+              <w:bottom w:w="90" w:type="dxa"/>
+              <w:end w:w="120" w:type="dxa"/>
+            </w:tcMar>
+          </w:tcPr>
+          <w:p>
+            <w:r>
+              <w:rPr>
+                <w:rFonts w:ascii="Calibri" w:hAnsi="Calibri" w:eastAsia="Microsoft YaHei"/>
+                <w:sz w:val="18"/>
+              </w:rPr>
+              <w:t>输出重启成本、废料成本、影响范围和回滚条件。</w:t>
+            </w:r>
+          </w:p>
+        </w:tc>
+      </w:tr>
+      <w:tr>
+        <w:tc>
+          <w:tcPr>
+            <w:tcW w:type="dxa" w:w="1296"/>
+            <w:vAlign w:val="center"/>
+            <w:tcMar>
+              <w:top w:w="90" w:type="dxa"/>
+              <w:start w:w="120" w:type="dxa"/>
+              <w:bottom w:w="90" w:type="dxa"/>
+              <w:end w:w="120" w:type="dxa"/>
+            </w:tcMar>
+          </w:tcPr>
+          <w:p>
+            <w:r>
+              <w:rPr>
+                <w:rFonts w:ascii="Calibri" w:hAnsi="Calibri" w:eastAsia="Microsoft YaHei"/>
+                <w:sz w:val="18"/>
+              </w:rPr>
+              <w:t>3. 特殊取舍</w:t>
+            </w:r>
+          </w:p>
+        </w:tc>
+        <w:tc>
+          <w:tcPr>
+            <w:tcW w:type="dxa" w:w="2880"/>
+            <w:vAlign w:val="center"/>
+            <w:tcMar>
+              <w:top w:w="90" w:type="dxa"/>
+              <w:start w:w="120" w:type="dxa"/>
+              <w:bottom w:w="90" w:type="dxa"/>
+              <w:end w:w="120" w:type="dxa"/>
+            </w:tcMar>
+          </w:tcPr>
+          <w:p>
+            <w:r>
+              <w:rPr>
+                <w:rFonts w:ascii="Calibri" w:hAnsi="Calibri" w:eastAsia="Microsoft YaHei"/>
+                <w:sz w:val="18"/>
+              </w:rPr>
+              <w:t>流程确需中断时，比较停空分、停合成气轮机或停下游装置的代价。</w:t>
+            </w:r>
+          </w:p>
+        </w:tc>
+        <w:tc>
+          <w:tcPr>
+            <w:tcW w:type="dxa" w:w="3384"/>
+            <w:vAlign w:val="center"/>
+            <w:tcMar>
+              <w:top w:w="90" w:type="dxa"/>
+              <w:start w:w="120" w:type="dxa"/>
+              <w:bottom w:w="90" w:type="dxa"/>
+              <w:end w:w="120" w:type="dxa"/>
+            </w:tcMar>
+          </w:tcPr>
+          <w:p>
+            <w:r>
+              <w:rPr>
+                <w:rFonts w:ascii="Calibri" w:hAnsi="Calibri" w:eastAsia="Microsoft YaHei"/>
+                <w:sz w:val="18"/>
+              </w:rPr>
+              <w:t>按安全、重启复杂度、废料损失、对主流程影响排序；已验证同类场景优先保气轮机驱动关键系统，停空分方案需班长/主管确认。</w:t>
+            </w:r>
+          </w:p>
+        </w:tc>
+        <w:tc>
+          <w:tcPr>
+            <w:tcW w:type="dxa" w:w="1800"/>
+            <w:vAlign w:val="center"/>
+            <w:tcMar>
+              <w:top w:w="90" w:type="dxa"/>
+              <w:start w:w="120" w:type="dxa"/>
+              <w:bottom w:w="90" w:type="dxa"/>
+              <w:end w:w="120" w:type="dxa"/>
+            </w:tcMar>
+          </w:tcPr>
+          <w:p>
+            <w:r>
+              <w:rPr>
+                <w:rFonts w:ascii="Calibri" w:hAnsi="Calibri" w:eastAsia="Microsoft YaHei"/>
+                <w:sz w:val="18"/>
+              </w:rPr>
+              <w:t>作为专家规则，不做前端自动执行；每次结果回写知识库。</w:t>
+            </w:r>
+          </w:p>
+        </w:tc>
+      </w:tr>
+    </w:tbl>
+    <w:p>
+      <w:pPr>
+        <w:pStyle w:val="Heading1"/>
+      </w:pPr>
+      <w:r>
+        <w:t>7. 30/60/90天落地路径</w:t>
       </w:r>
     </w:p>
     <w:tbl>
@@ -1882,7 +2257,7 @@
         <w:pStyle w:val="Heading1"/>
       </w:pPr>
       <w:r>
-        <w:t>7. 验收与停用条件</w:t>
+        <w:t>8. 验收与停用条件</w:t>
       </w:r>
     </w:p>
     <w:p>

</xml_diff>

<commit_message>
Map existing plant systems for integration
</commit_message>
<xml_diff>
--- a/提交材料/02_整体解决方案书.docx
+++ b/提交材料/02_整体解决方案书.docx
@@ -463,7 +463,609 @@
         <w:pStyle w:val="Heading1"/>
       </w:pPr>
       <w:r>
-        <w:t>3. 飞书功能模块在方案中的位置</w:t>
+        <w:t>3. 现有系统对接口径（待企业确认）</w:t>
+      </w:r>
+    </w:p>
+    <w:p>
+      <w:r>
+        <w:rPr>
+          <w:rFonts w:ascii="Calibri" w:hAnsi="Calibri" w:eastAsia="Microsoft YaHei"/>
+        </w:rPr>
+        <w:t>企业导师补充了云图现场正在使用或建设中的关键系统。决赛方案据此把AI调控师定位为现有商业软件之上的“跨系统调度编排层”，不重做DCS、MES、APC或压机软件，而是理清各系统主要功能、数据流向和写回边界。</w:t>
+      </w:r>
+    </w:p>
+    <w:tbl>
+      <w:tblPr>
+        <w:tblStyle w:val="TableGrid"/>
+        <w:tblW w:type="auto" w:w="0"/>
+        <w:jc w:val="center"/>
+        <w:tblLayout w:type="fixed"/>
+        <w:tblLook w:firstColumn="1" w:firstRow="1" w:lastColumn="0" w:lastRow="0" w:noHBand="0" w:noVBand="1" w:val="04A0"/>
+      </w:tblPr>
+      <w:tblGrid>
+        <w:gridCol w:w="2441"/>
+        <w:gridCol w:w="2441"/>
+        <w:gridCol w:w="2441"/>
+        <w:gridCol w:w="2441"/>
+      </w:tblGrid>
+      <w:tr>
+        <w:tc>
+          <w:tcPr>
+            <w:tcW w:type="dxa" w:w="1512"/>
+            <w:shd w:fill="EAF2F8"/>
+            <w:tcMar>
+              <w:top w:w="90" w:type="dxa"/>
+              <w:start w:w="120" w:type="dxa"/>
+              <w:bottom w:w="90" w:type="dxa"/>
+              <w:end w:w="120" w:type="dxa"/>
+            </w:tcMar>
+          </w:tcPr>
+          <w:p>
+            <w:r>
+              <w:rPr>
+                <w:rFonts w:ascii="Calibri" w:hAnsi="Calibri" w:eastAsia="Microsoft YaHei"/>
+                <w:b/>
+              </w:rPr>
+              <w:t>层级</w:t>
+            </w:r>
+          </w:p>
+        </w:tc>
+        <w:tc>
+          <w:tcPr>
+            <w:tcW w:type="dxa" w:w="2232"/>
+            <w:shd w:fill="EAF2F8"/>
+            <w:tcMar>
+              <w:top w:w="90" w:type="dxa"/>
+              <w:start w:w="120" w:type="dxa"/>
+              <w:bottom w:w="90" w:type="dxa"/>
+              <w:end w:w="120" w:type="dxa"/>
+            </w:tcMar>
+          </w:tcPr>
+          <w:p>
+            <w:r>
+              <w:rPr>
+                <w:rFonts w:ascii="Calibri" w:hAnsi="Calibri" w:eastAsia="Microsoft YaHei"/>
+                <w:b/>
+              </w:rPr>
+              <w:t>现场系统</w:t>
+            </w:r>
+          </w:p>
+        </w:tc>
+        <w:tc>
+          <w:tcPr>
+            <w:tcW w:type="dxa" w:w="3672"/>
+            <w:shd w:fill="EAF2F8"/>
+            <w:tcMar>
+              <w:top w:w="90" w:type="dxa"/>
+              <w:start w:w="120" w:type="dxa"/>
+              <w:bottom w:w="90" w:type="dxa"/>
+              <w:end w:w="120" w:type="dxa"/>
+            </w:tcMar>
+          </w:tcPr>
+          <w:p>
+            <w:r>
+              <w:rPr>
+                <w:rFonts w:ascii="Calibri" w:hAnsi="Calibri" w:eastAsia="Microsoft YaHei"/>
+                <w:b/>
+              </w:rPr>
+              <w:t>主要作用</w:t>
+            </w:r>
+          </w:p>
+        </w:tc>
+        <w:tc>
+          <w:tcPr>
+            <w:tcW w:type="dxa" w:w="1800"/>
+            <w:shd w:fill="EAF2F8"/>
+            <w:tcMar>
+              <w:top w:w="90" w:type="dxa"/>
+              <w:start w:w="120" w:type="dxa"/>
+              <w:bottom w:w="90" w:type="dxa"/>
+              <w:end w:w="120" w:type="dxa"/>
+            </w:tcMar>
+          </w:tcPr>
+          <w:p>
+            <w:r>
+              <w:rPr>
+                <w:rFonts w:ascii="Calibri" w:hAnsi="Calibri" w:eastAsia="Microsoft YaHei"/>
+                <w:b/>
+              </w:rPr>
+              <w:t>AI调控师边界</w:t>
+            </w:r>
+          </w:p>
+        </w:tc>
+      </w:tr>
+      <w:tr>
+        <w:tc>
+          <w:tcPr>
+            <w:tcW w:type="dxa" w:w="1512"/>
+            <w:vAlign w:val="center"/>
+            <w:tcMar>
+              <w:top w:w="90" w:type="dxa"/>
+              <w:start w:w="120" w:type="dxa"/>
+              <w:bottom w:w="90" w:type="dxa"/>
+              <w:end w:w="120" w:type="dxa"/>
+            </w:tcMar>
+          </w:tcPr>
+          <w:p>
+            <w:r>
+              <w:rPr>
+                <w:rFonts w:ascii="Calibri" w:hAnsi="Calibri" w:eastAsia="Microsoft YaHei"/>
+                <w:sz w:val="18"/>
+              </w:rPr>
+              <w:t>运行管理层</w:t>
+            </w:r>
+          </w:p>
+        </w:tc>
+        <w:tc>
+          <w:tcPr>
+            <w:tcW w:type="dxa" w:w="2232"/>
+            <w:vAlign w:val="center"/>
+            <w:tcMar>
+              <w:top w:w="90" w:type="dxa"/>
+              <w:start w:w="120" w:type="dxa"/>
+              <w:bottom w:w="90" w:type="dxa"/>
+              <w:end w:w="120" w:type="dxa"/>
+            </w:tcMar>
+          </w:tcPr>
+          <w:p>
+            <w:r>
+              <w:rPr>
+                <w:rFonts w:ascii="Calibri" w:hAnsi="Calibri" w:eastAsia="Microsoft YaHei"/>
+                <w:sz w:val="18"/>
+              </w:rPr>
+              <w:t>MES与合成氨调控平台</w:t>
+            </w:r>
+          </w:p>
+        </w:tc>
+        <w:tc>
+          <w:tcPr>
+            <w:tcW w:type="dxa" w:w="3672"/>
+            <w:vAlign w:val="center"/>
+            <w:tcMar>
+              <w:top w:w="90" w:type="dxa"/>
+              <w:start w:w="120" w:type="dxa"/>
+              <w:bottom w:w="90" w:type="dxa"/>
+              <w:end w:w="120" w:type="dxa"/>
+            </w:tcMar>
+          </w:tcPr>
+          <w:p>
+            <w:r>
+              <w:rPr>
+                <w:rFonts w:ascii="Calibri" w:hAnsi="Calibri" w:eastAsia="Microsoft YaHei"/>
+                <w:sz w:val="18"/>
+              </w:rPr>
+              <w:t>承接日计划、班次执行、交接摘要、负荷调整记录和复盘闭环。</w:t>
+            </w:r>
+          </w:p>
+        </w:tc>
+        <w:tc>
+          <w:tcPr>
+            <w:tcW w:type="dxa" w:w="1800"/>
+            <w:vAlign w:val="center"/>
+            <w:tcMar>
+              <w:top w:w="90" w:type="dxa"/>
+              <w:start w:w="120" w:type="dxa"/>
+              <w:bottom w:w="90" w:type="dxa"/>
+              <w:end w:w="120" w:type="dxa"/>
+            </w:tcMar>
+          </w:tcPr>
+          <w:p>
+            <w:r>
+              <w:rPr>
+                <w:rFonts w:ascii="Calibri" w:hAnsi="Calibri" w:eastAsia="Microsoft YaHei"/>
+                <w:sz w:val="18"/>
+              </w:rPr>
+              <w:t>审批通过后只写计划摘要、交接说明和复盘结果。</w:t>
+            </w:r>
+          </w:p>
+        </w:tc>
+      </w:tr>
+      <w:tr>
+        <w:tc>
+          <w:tcPr>
+            <w:tcW w:type="dxa" w:w="1512"/>
+            <w:vAlign w:val="center"/>
+            <w:tcMar>
+              <w:top w:w="90" w:type="dxa"/>
+              <w:start w:w="120" w:type="dxa"/>
+              <w:bottom w:w="90" w:type="dxa"/>
+              <w:end w:w="120" w:type="dxa"/>
+            </w:tcMar>
+          </w:tcPr>
+          <w:p>
+            <w:r>
+              <w:rPr>
+                <w:rFonts w:ascii="Calibri" w:hAnsi="Calibri" w:eastAsia="Microsoft YaHei"/>
+                <w:sz w:val="18"/>
+              </w:rPr>
+              <w:t>数据采集层</w:t>
+            </w:r>
+          </w:p>
+        </w:tc>
+        <w:tc>
+          <w:tcPr>
+            <w:tcW w:type="dxa" w:w="2232"/>
+            <w:vAlign w:val="center"/>
+            <w:tcMar>
+              <w:top w:w="90" w:type="dxa"/>
+              <w:start w:w="120" w:type="dxa"/>
+              <w:bottom w:w="90" w:type="dxa"/>
+              <w:end w:w="120" w:type="dxa"/>
+            </w:tcMar>
+          </w:tcPr>
+          <w:p>
+            <w:r>
+              <w:rPr>
+                <w:rFonts w:ascii="Calibri" w:hAnsi="Calibri" w:eastAsia="Microsoft YaHei"/>
+                <w:sz w:val="18"/>
+              </w:rPr>
+              <w:t>IoT平台</w:t>
+            </w:r>
+          </w:p>
+        </w:tc>
+        <w:tc>
+          <w:tcPr>
+            <w:tcW w:type="dxa" w:w="3672"/>
+            <w:vAlign w:val="center"/>
+            <w:tcMar>
+              <w:top w:w="90" w:type="dxa"/>
+              <w:start w:w="120" w:type="dxa"/>
+              <w:bottom w:w="90" w:type="dxa"/>
+              <w:end w:w="120" w:type="dxa"/>
+            </w:tcMar>
+          </w:tcPr>
+          <w:p>
+            <w:r>
+              <w:rPr>
+                <w:rFonts w:ascii="Calibri" w:hAnsi="Calibri" w:eastAsia="Microsoft YaHei"/>
+                <w:sz w:val="18"/>
+              </w:rPr>
+              <w:t>读取负荷、温度、压力、流量、电耗、蒸汽、罐区等实时/准实时数据。</w:t>
+            </w:r>
+          </w:p>
+        </w:tc>
+        <w:tc>
+          <w:tcPr>
+            <w:tcW w:type="dxa" w:w="1800"/>
+            <w:vAlign w:val="center"/>
+            <w:tcMar>
+              <w:top w:w="90" w:type="dxa"/>
+              <w:start w:w="120" w:type="dxa"/>
+              <w:bottom w:w="90" w:type="dxa"/>
+              <w:end w:w="120" w:type="dxa"/>
+            </w:tcMar>
+          </w:tcPr>
+          <w:p>
+            <w:r>
+              <w:rPr>
+                <w:rFonts w:ascii="Calibri" w:hAnsi="Calibri" w:eastAsia="Microsoft YaHei"/>
+                <w:sz w:val="18"/>
+              </w:rPr>
+              <w:t>作为AI调控师的只读事实源，不替代DCS控制。</w:t>
+            </w:r>
+          </w:p>
+        </w:tc>
+      </w:tr>
+      <w:tr>
+        <w:tc>
+          <w:tcPr>
+            <w:tcW w:type="dxa" w:w="1512"/>
+            <w:vAlign w:val="center"/>
+            <w:tcMar>
+              <w:top w:w="90" w:type="dxa"/>
+              <w:start w:w="120" w:type="dxa"/>
+              <w:bottom w:w="90" w:type="dxa"/>
+              <w:end w:w="120" w:type="dxa"/>
+            </w:tcMar>
+          </w:tcPr>
+          <w:p>
+            <w:r>
+              <w:rPr>
+                <w:rFonts w:ascii="Calibri" w:hAnsi="Calibri" w:eastAsia="Microsoft YaHei"/>
+                <w:sz w:val="18"/>
+              </w:rPr>
+              <w:t>生产控制层</w:t>
+            </w:r>
+          </w:p>
+        </w:tc>
+        <w:tc>
+          <w:tcPr>
+            <w:tcW w:type="dxa" w:w="2232"/>
+            <w:vAlign w:val="center"/>
+            <w:tcMar>
+              <w:top w:w="90" w:type="dxa"/>
+              <w:start w:w="120" w:type="dxa"/>
+              <w:bottom w:w="90" w:type="dxa"/>
+              <w:end w:w="120" w:type="dxa"/>
+            </w:tcMar>
+          </w:tcPr>
+          <w:p>
+            <w:r>
+              <w:rPr>
+                <w:rFonts w:ascii="Calibri" w:hAnsi="Calibri" w:eastAsia="Microsoft YaHei"/>
+                <w:sz w:val="18"/>
+              </w:rPr>
+              <w:t>合成氨DCS</w:t>
+            </w:r>
+          </w:p>
+        </w:tc>
+        <w:tc>
+          <w:tcPr>
+            <w:tcW w:type="dxa" w:w="3672"/>
+            <w:vAlign w:val="center"/>
+            <w:tcMar>
+              <w:top w:w="90" w:type="dxa"/>
+              <w:start w:w="120" w:type="dxa"/>
+              <w:bottom w:w="90" w:type="dxa"/>
+              <w:end w:w="120" w:type="dxa"/>
+            </w:tcMar>
+          </w:tcPr>
+          <w:p>
+            <w:r>
+              <w:rPr>
+                <w:rFonts w:ascii="Calibri" w:hAnsi="Calibri" w:eastAsia="Microsoft YaHei"/>
+                <w:sz w:val="18"/>
+              </w:rPr>
+              <w:t>完成合成氨主装置的局部回路控制、顺控、报警和联锁保护。</w:t>
+            </w:r>
+          </w:p>
+        </w:tc>
+        <w:tc>
+          <w:tcPr>
+            <w:tcW w:type="dxa" w:w="1800"/>
+            <w:vAlign w:val="center"/>
+            <w:tcMar>
+              <w:top w:w="90" w:type="dxa"/>
+              <w:start w:w="120" w:type="dxa"/>
+              <w:bottom w:w="90" w:type="dxa"/>
+              <w:end w:w="120" w:type="dxa"/>
+            </w:tcMar>
+          </w:tcPr>
+          <w:p>
+            <w:r>
+              <w:rPr>
+                <w:rFonts w:ascii="Calibri" w:hAnsi="Calibri" w:eastAsia="Microsoft YaHei"/>
+                <w:sz w:val="18"/>
+              </w:rPr>
+              <w:t>AI只读DCS historian摘要，不直接写控制参数。</w:t>
+            </w:r>
+          </w:p>
+        </w:tc>
+      </w:tr>
+      <w:tr>
+        <w:tc>
+          <w:tcPr>
+            <w:tcW w:type="dxa" w:w="1512"/>
+            <w:vAlign w:val="center"/>
+            <w:tcMar>
+              <w:top w:w="90" w:type="dxa"/>
+              <w:start w:w="120" w:type="dxa"/>
+              <w:bottom w:w="90" w:type="dxa"/>
+              <w:end w:w="120" w:type="dxa"/>
+            </w:tcMar>
+          </w:tcPr>
+          <w:p>
+            <w:r>
+              <w:rPr>
+                <w:rFonts w:ascii="Calibri" w:hAnsi="Calibri" w:eastAsia="Microsoft YaHei"/>
+                <w:sz w:val="18"/>
+              </w:rPr>
+              <w:t>热电与公辅控制层</w:t>
+            </w:r>
+          </w:p>
+        </w:tc>
+        <w:tc>
+          <w:tcPr>
+            <w:tcW w:type="dxa" w:w="2232"/>
+            <w:vAlign w:val="center"/>
+            <w:tcMar>
+              <w:top w:w="90" w:type="dxa"/>
+              <w:start w:w="120" w:type="dxa"/>
+              <w:bottom w:w="90" w:type="dxa"/>
+              <w:end w:w="120" w:type="dxa"/>
+            </w:tcMar>
+          </w:tcPr>
+          <w:p>
+            <w:r>
+              <w:rPr>
+                <w:rFonts w:ascii="Calibri" w:hAnsi="Calibri" w:eastAsia="Microsoft YaHei"/>
+                <w:sz w:val="18"/>
+              </w:rPr>
+              <w:t>和利时DCS与热电APC</w:t>
+            </w:r>
+          </w:p>
+        </w:tc>
+        <w:tc>
+          <w:tcPr>
+            <w:tcW w:type="dxa" w:w="3672"/>
+            <w:vAlign w:val="center"/>
+            <w:tcMar>
+              <w:top w:w="90" w:type="dxa"/>
+              <w:start w:w="120" w:type="dxa"/>
+              <w:bottom w:w="90" w:type="dxa"/>
+              <w:end w:w="120" w:type="dxa"/>
+            </w:tcMar>
+          </w:tcPr>
+          <w:p>
+            <w:r>
+              <w:rPr>
+                <w:rFonts w:ascii="Calibri" w:hAnsi="Calibri" w:eastAsia="Microsoft YaHei"/>
+                <w:sz w:val="18"/>
+              </w:rPr>
+              <w:t>提供蒸汽、电力、公辅负荷、管网约束和热电优化结果。</w:t>
+            </w:r>
+          </w:p>
+        </w:tc>
+        <w:tc>
+          <w:tcPr>
+            <w:tcW w:type="dxa" w:w="1800"/>
+            <w:vAlign w:val="center"/>
+            <w:tcMar>
+              <w:top w:w="90" w:type="dxa"/>
+              <w:start w:w="120" w:type="dxa"/>
+              <w:bottom w:w="90" w:type="dxa"/>
+              <w:end w:w="120" w:type="dxa"/>
+            </w:tcMar>
+          </w:tcPr>
+          <w:p>
+            <w:r>
+              <w:rPr>
+                <w:rFonts w:ascii="Calibri" w:hAnsi="Calibri" w:eastAsia="Microsoft YaHei"/>
+                <w:sz w:val="18"/>
+              </w:rPr>
+              <w:t>读取热电APC约束余量和能耗窗口，生成跨装置调度建议。</w:t>
+            </w:r>
+          </w:p>
+        </w:tc>
+      </w:tr>
+      <w:tr>
+        <w:tc>
+          <w:tcPr>
+            <w:tcW w:type="dxa" w:w="1512"/>
+            <w:vAlign w:val="center"/>
+            <w:tcMar>
+              <w:top w:w="90" w:type="dxa"/>
+              <w:start w:w="120" w:type="dxa"/>
+              <w:bottom w:w="90" w:type="dxa"/>
+              <w:end w:w="120" w:type="dxa"/>
+            </w:tcMar>
+          </w:tcPr>
+          <w:p>
+            <w:r>
+              <w:rPr>
+                <w:rFonts w:ascii="Calibri" w:hAnsi="Calibri" w:eastAsia="Microsoft YaHei"/>
+                <w:sz w:val="18"/>
+              </w:rPr>
+              <w:t>机组与压机层</w:t>
+            </w:r>
+          </w:p>
+        </w:tc>
+        <w:tc>
+          <w:tcPr>
+            <w:tcW w:type="dxa" w:w="2232"/>
+            <w:vAlign w:val="center"/>
+            <w:tcMar>
+              <w:top w:w="90" w:type="dxa"/>
+              <w:start w:w="120" w:type="dxa"/>
+              <w:bottom w:w="90" w:type="dxa"/>
+              <w:end w:w="120" w:type="dxa"/>
+            </w:tcMar>
+          </w:tcPr>
+          <w:p>
+            <w:r>
+              <w:rPr>
+                <w:rFonts w:ascii="Calibri" w:hAnsi="Calibri" w:eastAsia="Microsoft YaHei"/>
+                <w:sz w:val="18"/>
+              </w:rPr>
+              <w:t>SMC压机软件、康迪森机组数据</w:t>
+            </w:r>
+          </w:p>
+        </w:tc>
+        <w:tc>
+          <w:tcPr>
+            <w:tcW w:type="dxa" w:w="3672"/>
+            <w:vAlign w:val="center"/>
+            <w:tcMar>
+              <w:top w:w="90" w:type="dxa"/>
+              <w:start w:w="120" w:type="dxa"/>
+              <w:bottom w:w="90" w:type="dxa"/>
+              <w:end w:w="120" w:type="dxa"/>
+            </w:tcMar>
+          </w:tcPr>
+          <w:p>
+            <w:r>
+              <w:rPr>
+                <w:rFonts w:ascii="Calibri" w:hAnsi="Calibri" w:eastAsia="Microsoft YaHei"/>
+                <w:sz w:val="18"/>
+              </w:rPr>
+              <w:t>提供离心压缩机、气轮机驱动系统、关键机组健康和弱信号趋势。</w:t>
+            </w:r>
+          </w:p>
+        </w:tc>
+        <w:tc>
+          <w:tcPr>
+            <w:tcW w:type="dxa" w:w="1800"/>
+            <w:vAlign w:val="center"/>
+            <w:tcMar>
+              <w:top w:w="90" w:type="dxa"/>
+              <w:start w:w="120" w:type="dxa"/>
+              <w:bottom w:w="90" w:type="dxa"/>
+              <w:end w:w="120" w:type="dxa"/>
+            </w:tcMar>
+          </w:tcPr>
+          <w:p>
+            <w:r>
+              <w:rPr>
+                <w:rFonts w:ascii="Calibri" w:hAnsi="Calibri" w:eastAsia="Microsoft YaHei"/>
+                <w:sz w:val="18"/>
+              </w:rPr>
+              <w:t>用于设备护机、弱信号预警和特殊停机取舍，不直接触发开停车。</w:t>
+            </w:r>
+          </w:p>
+        </w:tc>
+      </w:tr>
+    </w:tbl>
+    <w:p>
+      <w:pPr>
+        <w:pStyle w:val="ListBullet"/>
+      </w:pPr>
+      <w:r>
+        <w:rPr>
+          <w:rFonts w:ascii="Calibri" w:hAnsi="Calibri" w:eastAsia="Microsoft YaHei"/>
+        </w:rPr>
+        <w:t>MES与合成氨调控平台：导师口述合成氨调控平台为“海尔豪斯”，具体厂商名称待企业确认。</w:t>
+      </w:r>
+    </w:p>
+    <w:p>
+      <w:pPr>
+        <w:pStyle w:val="ListBullet"/>
+      </w:pPr>
+      <w:r>
+        <w:rPr>
+          <w:rFonts w:ascii="Calibri" w:hAnsi="Calibri" w:eastAsia="Microsoft YaHei"/>
+        </w:rPr>
+        <w:t>IoT平台：采集合成氨DCS底层数据，形成可供上层系统读取的过程数据底座。</w:t>
+      </w:r>
+    </w:p>
+    <w:p>
+      <w:pPr>
+        <w:pStyle w:val="ListBullet"/>
+      </w:pPr>
+      <w:r>
+        <w:rPr>
+          <w:rFonts w:ascii="Calibri" w:hAnsi="Calibri" w:eastAsia="Microsoft YaHei"/>
+        </w:rPr>
+        <w:t>合成氨DCS：导师口述为中控体系，具体名称待企业确认。</w:t>
+      </w:r>
+    </w:p>
+    <w:p>
+      <w:pPr>
+        <w:pStyle w:val="ListBullet"/>
+      </w:pPr>
+      <w:r>
+        <w:rPr>
+          <w:rFonts w:ascii="Calibri" w:hAnsi="Calibri" w:eastAsia="Microsoft YaHei"/>
+        </w:rPr>
+        <w:t>和利时DCS与热电APC：热电侧采用和利时DCS，并已有APC先进控制用于热电管网优化。</w:t>
+      </w:r>
+    </w:p>
+    <w:p>
+      <w:pPr>
+        <w:pStyle w:val="ListBullet"/>
+      </w:pPr>
+      <w:r>
+        <w:rPr>
+          <w:rFonts w:ascii="Calibri" w:hAnsi="Calibri" w:eastAsia="Microsoft YaHei"/>
+        </w:rPr>
+        <w:t>SMC压机软件、康迪森机组数据：导师口述机组数据已接入和利时平台，具体点位清单待企业确认。</w:t>
+      </w:r>
+    </w:p>
+    <w:p>
+      <w:pPr>
+        <w:pStyle w:val="Heading1"/>
+      </w:pPr>
+      <w:r>
+        <w:t>4. 飞书功能模块在方案中的位置</w:t>
       </w:r>
     </w:p>
     <w:p>
@@ -1010,7 +1612,7 @@
         <w:pStyle w:val="Heading1"/>
       </w:pPr>
       <w:r>
-        <w:t>4. 与APC/RTO体系的接口关系</w:t>
+        <w:t>5. 与APC/RTO体系的接口关系</w:t>
       </w:r>
     </w:p>
     <w:p>
@@ -1062,7 +1664,7 @@
         <w:pStyle w:val="Heading1"/>
       </w:pPr>
       <w:r>
-        <w:t>5. 典型场景</w:t>
+        <w:t>6. 典型场景</w:t>
       </w:r>
     </w:p>
     <w:tbl>
@@ -1515,7 +2117,7 @@
         <w:pStyle w:val="Heading1"/>
       </w:pPr>
       <w:r>
-        <w:t>6. 跨装置联动的调度优先级</w:t>
+        <w:t>7. 跨装置联动的调度优先级</w:t>
       </w:r>
     </w:p>
     <w:p>
@@ -1890,7 +2492,7 @@
         <w:pStyle w:val="Heading1"/>
       </w:pPr>
       <w:r>
-        <w:t>7. 30/60/90天落地路径</w:t>
+        <w:t>8. 30/60/90天落地路径</w:t>
       </w:r>
     </w:p>
     <w:tbl>
@@ -2257,7 +2859,7 @@
         <w:pStyle w:val="Heading1"/>
       </w:pPr>
       <w:r>
-        <w:t>8. 验收与停用条件</w:t>
+        <w:t>9. 验收与停用条件</w:t>
       </w:r>
     </w:p>
     <w:p>

</xml_diff>

<commit_message>
Add marginal contribution dispatch economics
</commit_message>
<xml_diff>
--- a/提交材料/02_整体解决方案书.docx
+++ b/提交材料/02_整体解决方案书.docx
@@ -1634,7 +1634,7 @@
         <w:rPr>
           <w:rFonts w:ascii="Calibri" w:hAnsi="Calibri" w:eastAsia="Microsoft YaHei"/>
         </w:rPr>
-        <w:t>RTO侧：平台把天然气/煤气化、蒸汽、电力、液氨库存占用、订单延期和外售机会成本转化为经济目标，供实时优化或离线回放使用。</w:t>
+        <w:t>RTO侧：平台把天然气/煤气化、蒸汽、电力、液氨库存占用、订单延期、外售机会成本、边际贡献和固定成本吸收转化为经济目标，供实时优化或离线回放使用。</w:t>
       </w:r>
     </w:p>
     <w:p>
@@ -2117,7 +2117,492 @@
         <w:pStyle w:val="Heading1"/>
       </w:pPr>
       <w:r>
-        <w:t>7. 跨装置联动的调度优先级</w:t>
+        <w:t>7. 产供销经济取舍口径</w:t>
+      </w:r>
+    </w:p>
+    <w:p>
+      <w:r>
+        <w:rPr>
+          <w:rFonts w:ascii="Calibri" w:hAnsi="Calibri" w:eastAsia="Microsoft YaHei"/>
+        </w:rPr>
+        <w:t>产供销调度不能简单按“售价高于完全成本才生产”判断。化工连续装置存在折旧、人工、公辅和装置重启等固定或半固定成本，某个下游产品即使短期售价低于完全成本，只要能覆盖变动成本、贡献一部分固定成本、维持流程连续或保障战略订单，也可能仍然值得开；反之，若边际贡献为负且占用稀缺液氨、能源或关键设备能力，则应考虑降负荷或停产。</w:t>
+      </w:r>
+    </w:p>
+    <w:tbl>
+      <w:tblPr>
+        <w:tblStyle w:val="TableGrid"/>
+        <w:tblW w:type="auto" w:w="0"/>
+        <w:jc w:val="center"/>
+        <w:tblLayout w:type="fixed"/>
+        <w:tblLook w:firstColumn="1" w:firstRow="1" w:lastColumn="0" w:lastRow="0" w:noHBand="0" w:noVBand="1" w:val="04A0"/>
+      </w:tblPr>
+      <w:tblGrid>
+        <w:gridCol w:w="3255"/>
+        <w:gridCol w:w="3255"/>
+        <w:gridCol w:w="3255"/>
+      </w:tblGrid>
+      <w:tr>
+        <w:tc>
+          <w:tcPr>
+            <w:tcW w:type="dxa" w:w="1512"/>
+            <w:shd w:fill="EAF2F8"/>
+            <w:tcMar>
+              <w:top w:w="90" w:type="dxa"/>
+              <w:start w:w="120" w:type="dxa"/>
+              <w:bottom w:w="90" w:type="dxa"/>
+              <w:end w:w="120" w:type="dxa"/>
+            </w:tcMar>
+          </w:tcPr>
+          <w:p>
+            <w:r>
+              <w:rPr>
+                <w:rFonts w:ascii="Calibri" w:hAnsi="Calibri" w:eastAsia="Microsoft YaHei"/>
+                <w:b/>
+              </w:rPr>
+              <w:t>测算项</w:t>
+            </w:r>
+          </w:p>
+        </w:tc>
+        <w:tc>
+          <w:tcPr>
+            <w:tcW w:type="dxa" w:w="2808"/>
+            <w:shd w:fill="EAF2F8"/>
+            <w:tcMar>
+              <w:top w:w="90" w:type="dxa"/>
+              <w:start w:w="120" w:type="dxa"/>
+              <w:bottom w:w="90" w:type="dxa"/>
+              <w:end w:w="120" w:type="dxa"/>
+            </w:tcMar>
+          </w:tcPr>
+          <w:p>
+            <w:r>
+              <w:rPr>
+                <w:rFonts w:ascii="Calibri" w:hAnsi="Calibri" w:eastAsia="Microsoft YaHei"/>
+                <w:b/>
+              </w:rPr>
+              <w:t>现场含义</w:t>
+            </w:r>
+          </w:p>
+        </w:tc>
+        <w:tc>
+          <w:tcPr>
+            <w:tcW w:type="dxa" w:w="4896"/>
+            <w:shd w:fill="EAF2F8"/>
+            <w:tcMar>
+              <w:top w:w="90" w:type="dxa"/>
+              <w:start w:w="120" w:type="dxa"/>
+              <w:bottom w:w="90" w:type="dxa"/>
+              <w:end w:w="120" w:type="dxa"/>
+            </w:tcMar>
+          </w:tcPr>
+          <w:p>
+            <w:r>
+              <w:rPr>
+                <w:rFonts w:ascii="Calibri" w:hAnsi="Calibri" w:eastAsia="Microsoft YaHei"/>
+                <w:b/>
+              </w:rPr>
+              <w:t>调控师使用方式</w:t>
+            </w:r>
+          </w:p>
+        </w:tc>
+      </w:tr>
+      <w:tr>
+        <w:tc>
+          <w:tcPr>
+            <w:tcW w:type="dxa" w:w="1512"/>
+            <w:vAlign w:val="center"/>
+            <w:tcMar>
+              <w:top w:w="90" w:type="dxa"/>
+              <w:start w:w="120" w:type="dxa"/>
+              <w:bottom w:w="90" w:type="dxa"/>
+              <w:end w:w="120" w:type="dxa"/>
+            </w:tcMar>
+          </w:tcPr>
+          <w:p>
+            <w:r>
+              <w:rPr>
+                <w:rFonts w:ascii="Calibri" w:hAnsi="Calibri" w:eastAsia="Microsoft YaHei"/>
+                <w:sz w:val="18"/>
+              </w:rPr>
+              <w:t>销售价</w:t>
+            </w:r>
+          </w:p>
+        </w:tc>
+        <w:tc>
+          <w:tcPr>
+            <w:tcW w:type="dxa" w:w="2808"/>
+            <w:vAlign w:val="center"/>
+            <w:tcMar>
+              <w:top w:w="90" w:type="dxa"/>
+              <w:start w:w="120" w:type="dxa"/>
+              <w:bottom w:w="90" w:type="dxa"/>
+              <w:end w:w="120" w:type="dxa"/>
+            </w:tcMar>
+          </w:tcPr>
+          <w:p>
+            <w:r>
+              <w:rPr>
+                <w:rFonts w:ascii="Calibri" w:hAnsi="Calibri" w:eastAsia="Microsoft YaHei"/>
+                <w:sz w:val="18"/>
+              </w:rPr>
+              <w:t>尿素、纯碱、硝酸、复合肥、液氨外售等实时或预测行情。</w:t>
+            </w:r>
+          </w:p>
+        </w:tc>
+        <w:tc>
+          <w:tcPr>
+            <w:tcW w:type="dxa" w:w="4896"/>
+            <w:vAlign w:val="center"/>
+            <w:tcMar>
+              <w:top w:w="90" w:type="dxa"/>
+              <w:start w:w="120" w:type="dxa"/>
+              <w:bottom w:w="90" w:type="dxa"/>
+              <w:end w:w="120" w:type="dxa"/>
+            </w:tcMar>
+          </w:tcPr>
+          <w:p>
+            <w:r>
+              <w:rPr>
+                <w:rFonts w:ascii="Calibri" w:hAnsi="Calibri" w:eastAsia="Microsoft YaHei"/>
+                <w:sz w:val="18"/>
+              </w:rPr>
+              <w:t>识别价格趋势，但不单独作为开停依据。</w:t>
+            </w:r>
+          </w:p>
+        </w:tc>
+      </w:tr>
+      <w:tr>
+        <w:tc>
+          <w:tcPr>
+            <w:tcW w:type="dxa" w:w="1512"/>
+            <w:vAlign w:val="center"/>
+            <w:tcMar>
+              <w:top w:w="90" w:type="dxa"/>
+              <w:start w:w="120" w:type="dxa"/>
+              <w:bottom w:w="90" w:type="dxa"/>
+              <w:end w:w="120" w:type="dxa"/>
+            </w:tcMar>
+          </w:tcPr>
+          <w:p>
+            <w:r>
+              <w:rPr>
+                <w:rFonts w:ascii="Calibri" w:hAnsi="Calibri" w:eastAsia="Microsoft YaHei"/>
+                <w:sz w:val="18"/>
+              </w:rPr>
+              <w:t>变动成本</w:t>
+            </w:r>
+          </w:p>
+        </w:tc>
+        <w:tc>
+          <w:tcPr>
+            <w:tcW w:type="dxa" w:w="2808"/>
+            <w:vAlign w:val="center"/>
+            <w:tcMar>
+              <w:top w:w="90" w:type="dxa"/>
+              <w:start w:w="120" w:type="dxa"/>
+              <w:bottom w:w="90" w:type="dxa"/>
+              <w:end w:w="120" w:type="dxa"/>
+            </w:tcMar>
+          </w:tcPr>
+          <w:p>
+            <w:r>
+              <w:rPr>
+                <w:rFonts w:ascii="Calibri" w:hAnsi="Calibri" w:eastAsia="Microsoft YaHei"/>
+                <w:sz w:val="18"/>
+              </w:rPr>
+              <w:t>原料、蒸汽、电力、包装、物流等随产量变化的成本。</w:t>
+            </w:r>
+          </w:p>
+        </w:tc>
+        <w:tc>
+          <w:tcPr>
+            <w:tcW w:type="dxa" w:w="4896"/>
+            <w:vAlign w:val="center"/>
+            <w:tcMar>
+              <w:top w:w="90" w:type="dxa"/>
+              <w:start w:w="120" w:type="dxa"/>
+              <w:bottom w:w="90" w:type="dxa"/>
+              <w:end w:w="120" w:type="dxa"/>
+            </w:tcMar>
+          </w:tcPr>
+          <w:p>
+            <w:r>
+              <w:rPr>
+                <w:rFonts w:ascii="Calibri" w:hAnsi="Calibri" w:eastAsia="Microsoft YaHei"/>
+                <w:sz w:val="18"/>
+              </w:rPr>
+              <w:t>判断产品是否至少覆盖直接增量成本。</w:t>
+            </w:r>
+          </w:p>
+        </w:tc>
+      </w:tr>
+      <w:tr>
+        <w:tc>
+          <w:tcPr>
+            <w:tcW w:type="dxa" w:w="1512"/>
+            <w:vAlign w:val="center"/>
+            <w:tcMar>
+              <w:top w:w="90" w:type="dxa"/>
+              <w:start w:w="120" w:type="dxa"/>
+              <w:bottom w:w="90" w:type="dxa"/>
+              <w:end w:w="120" w:type="dxa"/>
+            </w:tcMar>
+          </w:tcPr>
+          <w:p>
+            <w:r>
+              <w:rPr>
+                <w:rFonts w:ascii="Calibri" w:hAnsi="Calibri" w:eastAsia="Microsoft YaHei"/>
+                <w:sz w:val="18"/>
+              </w:rPr>
+              <w:t>边际贡献</w:t>
+            </w:r>
+          </w:p>
+        </w:tc>
+        <w:tc>
+          <w:tcPr>
+            <w:tcW w:type="dxa" w:w="2808"/>
+            <w:vAlign w:val="center"/>
+            <w:tcMar>
+              <w:top w:w="90" w:type="dxa"/>
+              <w:start w:w="120" w:type="dxa"/>
+              <w:bottom w:w="90" w:type="dxa"/>
+              <w:end w:w="120" w:type="dxa"/>
+            </w:tcMar>
+          </w:tcPr>
+          <w:p>
+            <w:r>
+              <w:rPr>
+                <w:rFonts w:ascii="Calibri" w:hAnsi="Calibri" w:eastAsia="Microsoft YaHei"/>
+                <w:sz w:val="18"/>
+              </w:rPr>
+              <w:t>销售收入扣除变动成本后对折旧、人工、公辅和固定费用的贡献。</w:t>
+            </w:r>
+          </w:p>
+        </w:tc>
+        <w:tc>
+          <w:tcPr>
+            <w:tcW w:type="dxa" w:w="4896"/>
+            <w:vAlign w:val="center"/>
+            <w:tcMar>
+              <w:top w:w="90" w:type="dxa"/>
+              <w:start w:w="120" w:type="dxa"/>
+              <w:bottom w:w="90" w:type="dxa"/>
+              <w:end w:w="120" w:type="dxa"/>
+            </w:tcMar>
+          </w:tcPr>
+          <w:p>
+            <w:r>
+              <w:rPr>
+                <w:rFonts w:ascii="Calibri" w:hAnsi="Calibri" w:eastAsia="Microsoft YaHei"/>
+                <w:sz w:val="18"/>
+              </w:rPr>
+              <w:t>售价低于完全成本但边际贡献为正时，可作为“继续开”的理由之一。</w:t>
+            </w:r>
+          </w:p>
+        </w:tc>
+      </w:tr>
+      <w:tr>
+        <w:tc>
+          <w:tcPr>
+            <w:tcW w:type="dxa" w:w="1512"/>
+            <w:vAlign w:val="center"/>
+            <w:tcMar>
+              <w:top w:w="90" w:type="dxa"/>
+              <w:start w:w="120" w:type="dxa"/>
+              <w:bottom w:w="90" w:type="dxa"/>
+              <w:end w:w="120" w:type="dxa"/>
+            </w:tcMar>
+          </w:tcPr>
+          <w:p>
+            <w:r>
+              <w:rPr>
+                <w:rFonts w:ascii="Calibri" w:hAnsi="Calibri" w:eastAsia="Microsoft YaHei"/>
+                <w:sz w:val="18"/>
+              </w:rPr>
+              <w:t>固定成本吸收</w:t>
+            </w:r>
+          </w:p>
+        </w:tc>
+        <w:tc>
+          <w:tcPr>
+            <w:tcW w:type="dxa" w:w="2808"/>
+            <w:vAlign w:val="center"/>
+            <w:tcMar>
+              <w:top w:w="90" w:type="dxa"/>
+              <w:start w:w="120" w:type="dxa"/>
+              <w:bottom w:w="90" w:type="dxa"/>
+              <w:end w:w="120" w:type="dxa"/>
+            </w:tcMar>
+          </w:tcPr>
+          <w:p>
+            <w:r>
+              <w:rPr>
+                <w:rFonts w:ascii="Calibri" w:hAnsi="Calibri" w:eastAsia="Microsoft YaHei"/>
+                <w:sz w:val="18"/>
+              </w:rPr>
+              <w:t>连续开车带走折旧、固定人工、装置维持费用和部分公辅摊销。</w:t>
+            </w:r>
+          </w:p>
+        </w:tc>
+        <w:tc>
+          <w:tcPr>
+            <w:tcW w:type="dxa" w:w="4896"/>
+            <w:vAlign w:val="center"/>
+            <w:tcMar>
+              <w:top w:w="90" w:type="dxa"/>
+              <w:start w:w="120" w:type="dxa"/>
+              <w:bottom w:w="90" w:type="dxa"/>
+              <w:end w:w="120" w:type="dxa"/>
+            </w:tcMar>
+          </w:tcPr>
+          <w:p>
+            <w:r>
+              <w:rPr>
+                <w:rFonts w:ascii="Calibri" w:hAnsi="Calibri" w:eastAsia="Microsoft YaHei"/>
+                <w:sz w:val="18"/>
+              </w:rPr>
+              <w:t>避免把短期账面亏损误判为必须停产。</w:t>
+            </w:r>
+          </w:p>
+        </w:tc>
+      </w:tr>
+      <w:tr>
+        <w:tc>
+          <w:tcPr>
+            <w:tcW w:type="dxa" w:w="1512"/>
+            <w:vAlign w:val="center"/>
+            <w:tcMar>
+              <w:top w:w="90" w:type="dxa"/>
+              <w:start w:w="120" w:type="dxa"/>
+              <w:bottom w:w="90" w:type="dxa"/>
+              <w:end w:w="120" w:type="dxa"/>
+            </w:tcMar>
+          </w:tcPr>
+          <w:p>
+            <w:r>
+              <w:rPr>
+                <w:rFonts w:ascii="Calibri" w:hAnsi="Calibri" w:eastAsia="Microsoft YaHei"/>
+                <w:sz w:val="18"/>
+              </w:rPr>
+              <w:t>机会成本</w:t>
+            </w:r>
+          </w:p>
+        </w:tc>
+        <w:tc>
+          <w:tcPr>
+            <w:tcW w:type="dxa" w:w="2808"/>
+            <w:vAlign w:val="center"/>
+            <w:tcMar>
+              <w:top w:w="90" w:type="dxa"/>
+              <w:start w:w="120" w:type="dxa"/>
+              <w:bottom w:w="90" w:type="dxa"/>
+              <w:end w:w="120" w:type="dxa"/>
+            </w:tcMar>
+          </w:tcPr>
+          <w:p>
+            <w:r>
+              <w:rPr>
+                <w:rFonts w:ascii="Calibri" w:hAnsi="Calibri" w:eastAsia="Microsoft YaHei"/>
+                <w:sz w:val="18"/>
+              </w:rPr>
+              <w:t>液氨有限时，供硝酸、尿素、纯碱、复合肥或外售之间的替代收益。</w:t>
+            </w:r>
+          </w:p>
+        </w:tc>
+        <w:tc>
+          <w:tcPr>
+            <w:tcW w:type="dxa" w:w="4896"/>
+            <w:vAlign w:val="center"/>
+            <w:tcMar>
+              <w:top w:w="90" w:type="dxa"/>
+              <w:start w:w="120" w:type="dxa"/>
+              <w:bottom w:w="90" w:type="dxa"/>
+              <w:end w:w="120" w:type="dxa"/>
+            </w:tcMar>
+          </w:tcPr>
+          <w:p>
+            <w:r>
+              <w:rPr>
+                <w:rFonts w:ascii="Calibri" w:hAnsi="Calibri" w:eastAsia="Microsoft YaHei"/>
+                <w:sz w:val="18"/>
+              </w:rPr>
+              <w:t>选择单位液氨综合贡献更高且不破坏安全连续性的去向。</w:t>
+            </w:r>
+          </w:p>
+        </w:tc>
+      </w:tr>
+      <w:tr>
+        <w:tc>
+          <w:tcPr>
+            <w:tcW w:type="dxa" w:w="1512"/>
+            <w:vAlign w:val="center"/>
+            <w:tcMar>
+              <w:top w:w="90" w:type="dxa"/>
+              <w:start w:w="120" w:type="dxa"/>
+              <w:bottom w:w="90" w:type="dxa"/>
+              <w:end w:w="120" w:type="dxa"/>
+            </w:tcMar>
+          </w:tcPr>
+          <w:p>
+            <w:r>
+              <w:rPr>
+                <w:rFonts w:ascii="Calibri" w:hAnsi="Calibri" w:eastAsia="Microsoft YaHei"/>
+                <w:sz w:val="18"/>
+              </w:rPr>
+              <w:t>停开成本</w:t>
+            </w:r>
+          </w:p>
+        </w:tc>
+        <w:tc>
+          <w:tcPr>
+            <w:tcW w:type="dxa" w:w="2808"/>
+            <w:vAlign w:val="center"/>
+            <w:tcMar>
+              <w:top w:w="90" w:type="dxa"/>
+              <w:start w:w="120" w:type="dxa"/>
+              <w:bottom w:w="90" w:type="dxa"/>
+              <w:end w:w="120" w:type="dxa"/>
+            </w:tcMar>
+          </w:tcPr>
+          <w:p>
+            <w:r>
+              <w:rPr>
+                <w:rFonts w:ascii="Calibri" w:hAnsi="Calibri" w:eastAsia="Microsoft YaHei"/>
+                <w:sz w:val="18"/>
+              </w:rPr>
+              <w:t>停车、重启、废料、人员和物料损失。</w:t>
+            </w:r>
+          </w:p>
+        </w:tc>
+        <w:tc>
+          <w:tcPr>
+            <w:tcW w:type="dxa" w:w="4896"/>
+            <w:vAlign w:val="center"/>
+            <w:tcMar>
+              <w:top w:w="90" w:type="dxa"/>
+              <w:start w:w="120" w:type="dxa"/>
+              <w:bottom w:w="90" w:type="dxa"/>
+              <w:end w:w="120" w:type="dxa"/>
+            </w:tcMar>
+          </w:tcPr>
+          <w:p>
+            <w:r>
+              <w:rPr>
+                <w:rFonts w:ascii="Calibri" w:hAnsi="Calibri" w:eastAsia="Microsoft YaHei"/>
+                <w:sz w:val="18"/>
+              </w:rPr>
+              <w:t>当边际贡献接近零时，停开成本可能决定是否继续运行。</w:t>
+            </w:r>
+          </w:p>
+        </w:tc>
+      </w:tr>
+    </w:tbl>
+    <w:p>
+      <w:pPr>
+        <w:pStyle w:val="Heading1"/>
+      </w:pPr>
+      <w:r>
+        <w:t>8. 跨装置联动的调度优先级</w:t>
       </w:r>
     </w:p>
     <w:p>
@@ -2492,7 +2977,7 @@
         <w:pStyle w:val="Heading1"/>
       </w:pPr>
       <w:r>
-        <w:t>8. 30/60/90天落地路径</w:t>
+        <w:t>9. 30/60/90天落地路径</w:t>
       </w:r>
     </w:p>
     <w:tbl>
@@ -2859,7 +3344,7 @@
         <w:pStyle w:val="Heading1"/>
       </w:pPr>
       <w:r>
-        <w:t>9. 验收与停用条件</w:t>
+        <w:t>10. 验收与停用条件</w:t>
       </w:r>
     </w:p>
     <w:p>

</xml_diff>

<commit_message>
Center supply chain orchestration focus
</commit_message>
<xml_diff>
--- a/提交材料/02_整体解决方案书.docx
+++ b/提交材料/02_整体解决方案书.docx
@@ -2117,7 +2117,468 @@
         <w:pStyle w:val="Heading1"/>
       </w:pPr>
       <w:r>
-        <w:t>7. 产供销经济取舍口径</w:t>
+        <w:t>7. 全产业链系统孤岛贯通</w:t>
+      </w:r>
+    </w:p>
+    <w:p>
+      <w:r>
+        <w:rPr>
+          <w:rFonts w:ascii="Calibri" w:hAnsi="Calibri" w:eastAsia="Microsoft YaHei"/>
+        </w:rPr>
+        <w:t>企业导师进一步指出，当前MES、DCS、IoT、APC、压机软件、热电平台和经营数据更像多个孤岛。真正困难的不是某一个系统有没有数据，而是调度长需要靠经验从庞大的系统中逐条抽取信息，再把价格、库存、订单、装置负荷、设备状态和公辅约束汇总判断。培养一个成熟调度长往往需要五年甚至更久，这正是AI调控师最应补位的地方。</w:t>
+      </w:r>
+    </w:p>
+    <w:tbl>
+      <w:tblPr>
+        <w:tblStyle w:val="TableGrid"/>
+        <w:tblW w:type="auto" w:w="0"/>
+        <w:jc w:val="center"/>
+        <w:tblLayout w:type="fixed"/>
+        <w:tblLook w:firstColumn="1" w:firstRow="1" w:lastColumn="0" w:lastRow="0" w:noHBand="0" w:noVBand="1" w:val="04A0"/>
+      </w:tblPr>
+      <w:tblGrid>
+        <w:gridCol w:w="2441"/>
+        <w:gridCol w:w="2441"/>
+        <w:gridCol w:w="2441"/>
+        <w:gridCol w:w="2441"/>
+      </w:tblGrid>
+      <w:tr>
+        <w:tc>
+          <w:tcPr>
+            <w:tcW w:type="dxa" w:w="1656"/>
+            <w:shd w:fill="EAF2F8"/>
+            <w:tcMar>
+              <w:top w:w="90" w:type="dxa"/>
+              <w:start w:w="120" w:type="dxa"/>
+              <w:bottom w:w="90" w:type="dxa"/>
+              <w:end w:w="120" w:type="dxa"/>
+            </w:tcMar>
+          </w:tcPr>
+          <w:p>
+            <w:r>
+              <w:rPr>
+                <w:rFonts w:ascii="Calibri" w:hAnsi="Calibri" w:eastAsia="Microsoft YaHei"/>
+                <w:b/>
+              </w:rPr>
+              <w:t>孤岛问题</w:t>
+            </w:r>
+          </w:p>
+        </w:tc>
+        <w:tc>
+          <w:tcPr>
+            <w:tcW w:type="dxa" w:w="2592"/>
+            <w:shd w:fill="EAF2F8"/>
+            <w:tcMar>
+              <w:top w:w="90" w:type="dxa"/>
+              <w:start w:w="120" w:type="dxa"/>
+              <w:bottom w:w="90" w:type="dxa"/>
+              <w:end w:w="120" w:type="dxa"/>
+            </w:tcMar>
+          </w:tcPr>
+          <w:p>
+            <w:r>
+              <w:rPr>
+                <w:rFonts w:ascii="Calibri" w:hAnsi="Calibri" w:eastAsia="Microsoft YaHei"/>
+                <w:b/>
+              </w:rPr>
+              <w:t>人工调度长当前做法</w:t>
+            </w:r>
+          </w:p>
+        </w:tc>
+        <w:tc>
+          <w:tcPr>
+            <w:tcW w:type="dxa" w:w="3528"/>
+            <w:shd w:fill="EAF2F8"/>
+            <w:tcMar>
+              <w:top w:w="90" w:type="dxa"/>
+              <w:start w:w="120" w:type="dxa"/>
+              <w:bottom w:w="90" w:type="dxa"/>
+              <w:end w:w="120" w:type="dxa"/>
+            </w:tcMar>
+          </w:tcPr>
+          <w:p>
+            <w:r>
+              <w:rPr>
+                <w:rFonts w:ascii="Calibri" w:hAnsi="Calibri" w:eastAsia="Microsoft YaHei"/>
+                <w:b/>
+              </w:rPr>
+              <w:t>AI调控师补位方式</w:t>
+            </w:r>
+          </w:p>
+        </w:tc>
+        <w:tc>
+          <w:tcPr>
+            <w:tcW w:type="dxa" w:w="1440"/>
+            <w:shd w:fill="EAF2F8"/>
+            <w:tcMar>
+              <w:top w:w="90" w:type="dxa"/>
+              <w:start w:w="120" w:type="dxa"/>
+              <w:bottom w:w="90" w:type="dxa"/>
+              <w:end w:w="120" w:type="dxa"/>
+            </w:tcMar>
+          </w:tcPr>
+          <w:p>
+            <w:r>
+              <w:rPr>
+                <w:rFonts w:ascii="Calibri" w:hAnsi="Calibri" w:eastAsia="Microsoft YaHei"/>
+                <w:b/>
+              </w:rPr>
+              <w:t>企业价值</w:t>
+            </w:r>
+          </w:p>
+        </w:tc>
+      </w:tr>
+      <w:tr>
+        <w:tc>
+          <w:tcPr>
+            <w:tcW w:type="dxa" w:w="1656"/>
+            <w:vAlign w:val="center"/>
+            <w:tcMar>
+              <w:top w:w="90" w:type="dxa"/>
+              <w:start w:w="120" w:type="dxa"/>
+              <w:bottom w:w="90" w:type="dxa"/>
+              <w:end w:w="120" w:type="dxa"/>
+            </w:tcMar>
+          </w:tcPr>
+          <w:p>
+            <w:r>
+              <w:rPr>
+                <w:rFonts w:ascii="Calibri" w:hAnsi="Calibri" w:eastAsia="Microsoft YaHei"/>
+                <w:sz w:val="18"/>
+              </w:rPr>
+              <w:t>信息分散</w:t>
+            </w:r>
+          </w:p>
+        </w:tc>
+        <w:tc>
+          <w:tcPr>
+            <w:tcW w:type="dxa" w:w="2592"/>
+            <w:vAlign w:val="center"/>
+            <w:tcMar>
+              <w:top w:w="90" w:type="dxa"/>
+              <w:start w:w="120" w:type="dxa"/>
+              <w:bottom w:w="90" w:type="dxa"/>
+              <w:end w:w="120" w:type="dxa"/>
+            </w:tcMar>
+          </w:tcPr>
+          <w:p>
+            <w:r>
+              <w:rPr>
+                <w:rFonts w:ascii="Calibri" w:hAnsi="Calibri" w:eastAsia="Microsoft YaHei"/>
+                <w:sz w:val="18"/>
+              </w:rPr>
+              <w:t>从MES、DCS、IoT、压机、热电和经营系统逐项查看。</w:t>
+            </w:r>
+          </w:p>
+        </w:tc>
+        <w:tc>
+          <w:tcPr>
+            <w:tcW w:type="dxa" w:w="3528"/>
+            <w:vAlign w:val="center"/>
+            <w:tcMar>
+              <w:top w:w="90" w:type="dxa"/>
+              <w:start w:w="120" w:type="dxa"/>
+              <w:bottom w:w="90" w:type="dxa"/>
+              <w:end w:w="120" w:type="dxa"/>
+            </w:tcMar>
+          </w:tcPr>
+          <w:p>
+            <w:r>
+              <w:rPr>
+                <w:rFonts w:ascii="Calibri" w:hAnsi="Calibri" w:eastAsia="Microsoft YaHei"/>
+                <w:sz w:val="18"/>
+              </w:rPr>
+              <w:t>自动汇聚班次事实表，形成订单、液氨、下游、设备、公辅、行情同屏口径。</w:t>
+            </w:r>
+          </w:p>
+        </w:tc>
+        <w:tc>
+          <w:tcPr>
+            <w:tcW w:type="dxa" w:w="1440"/>
+            <w:vAlign w:val="center"/>
+            <w:tcMar>
+              <w:top w:w="90" w:type="dxa"/>
+              <w:start w:w="120" w:type="dxa"/>
+              <w:bottom w:w="90" w:type="dxa"/>
+              <w:end w:w="120" w:type="dxa"/>
+            </w:tcMar>
+          </w:tcPr>
+          <w:p>
+            <w:r>
+              <w:rPr>
+                <w:rFonts w:ascii="Calibri" w:hAnsi="Calibri" w:eastAsia="Microsoft YaHei"/>
+                <w:sz w:val="18"/>
+              </w:rPr>
+              <w:t>减少信息搜集时间。</w:t>
+            </w:r>
+          </w:p>
+        </w:tc>
+      </w:tr>
+      <w:tr>
+        <w:tc>
+          <w:tcPr>
+            <w:tcW w:type="dxa" w:w="1656"/>
+            <w:vAlign w:val="center"/>
+            <w:tcMar>
+              <w:top w:w="90" w:type="dxa"/>
+              <w:start w:w="120" w:type="dxa"/>
+              <w:bottom w:w="90" w:type="dxa"/>
+              <w:end w:w="120" w:type="dxa"/>
+            </w:tcMar>
+          </w:tcPr>
+          <w:p>
+            <w:r>
+              <w:rPr>
+                <w:rFonts w:ascii="Calibri" w:hAnsi="Calibri" w:eastAsia="Microsoft YaHei"/>
+                <w:sz w:val="18"/>
+              </w:rPr>
+              <w:t>判断依赖经验</w:t>
+            </w:r>
+          </w:p>
+        </w:tc>
+        <w:tc>
+          <w:tcPr>
+            <w:tcW w:type="dxa" w:w="2592"/>
+            <w:vAlign w:val="center"/>
+            <w:tcMar>
+              <w:top w:w="90" w:type="dxa"/>
+              <w:start w:w="120" w:type="dxa"/>
+              <w:bottom w:w="90" w:type="dxa"/>
+              <w:end w:w="120" w:type="dxa"/>
+            </w:tcMar>
+          </w:tcPr>
+          <w:p>
+            <w:r>
+              <w:rPr>
+                <w:rFonts w:ascii="Calibri" w:hAnsi="Calibri" w:eastAsia="Microsoft YaHei"/>
+                <w:sz w:val="18"/>
+              </w:rPr>
+              <w:t>依靠调度长多年经验判断哪些点位、库存、价格和订单真正重要。</w:t>
+            </w:r>
+          </w:p>
+        </w:tc>
+        <w:tc>
+          <w:tcPr>
+            <w:tcW w:type="dxa" w:w="3528"/>
+            <w:vAlign w:val="center"/>
+            <w:tcMar>
+              <w:top w:w="90" w:type="dxa"/>
+              <w:start w:w="120" w:type="dxa"/>
+              <w:bottom w:w="90" w:type="dxa"/>
+              <w:end w:w="120" w:type="dxa"/>
+            </w:tcMar>
+          </w:tcPr>
+          <w:p>
+            <w:r>
+              <w:rPr>
+                <w:rFonts w:ascii="Calibri" w:hAnsi="Calibri" w:eastAsia="Microsoft YaHei"/>
+                <w:sz w:val="18"/>
+              </w:rPr>
+              <w:t>把历史采纳、驳回、事故复盘和专家规则转成可检索的调度知识图谱。</w:t>
+            </w:r>
+          </w:p>
+        </w:tc>
+        <w:tc>
+          <w:tcPr>
+            <w:tcW w:type="dxa" w:w="1440"/>
+            <w:vAlign w:val="center"/>
+            <w:tcMar>
+              <w:top w:w="90" w:type="dxa"/>
+              <w:start w:w="120" w:type="dxa"/>
+              <w:bottom w:w="90" w:type="dxa"/>
+              <w:end w:w="120" w:type="dxa"/>
+            </w:tcMar>
+          </w:tcPr>
+          <w:p>
+            <w:r>
+              <w:rPr>
+                <w:rFonts w:ascii="Calibri" w:hAnsi="Calibri" w:eastAsia="Microsoft YaHei"/>
+                <w:sz w:val="18"/>
+              </w:rPr>
+              <w:t>缩短新人培养周期。</w:t>
+            </w:r>
+          </w:p>
+        </w:tc>
+      </w:tr>
+      <w:tr>
+        <w:tc>
+          <w:tcPr>
+            <w:tcW w:type="dxa" w:w="1656"/>
+            <w:vAlign w:val="center"/>
+            <w:tcMar>
+              <w:top w:w="90" w:type="dxa"/>
+              <w:start w:w="120" w:type="dxa"/>
+              <w:bottom w:w="90" w:type="dxa"/>
+              <w:end w:w="120" w:type="dxa"/>
+            </w:tcMar>
+          </w:tcPr>
+          <w:p>
+            <w:r>
+              <w:rPr>
+                <w:rFonts w:ascii="Calibri" w:hAnsi="Calibri" w:eastAsia="Microsoft YaHei"/>
+                <w:sz w:val="18"/>
+              </w:rPr>
+              <w:t>跨线联动难</w:t>
+            </w:r>
+          </w:p>
+        </w:tc>
+        <w:tc>
+          <w:tcPr>
+            <w:tcW w:type="dxa" w:w="2592"/>
+            <w:vAlign w:val="center"/>
+            <w:tcMar>
+              <w:top w:w="90" w:type="dxa"/>
+              <w:start w:w="120" w:type="dxa"/>
+              <w:bottom w:w="90" w:type="dxa"/>
+              <w:end w:w="120" w:type="dxa"/>
+            </w:tcMar>
+          </w:tcPr>
+          <w:p>
+            <w:r>
+              <w:rPr>
+                <w:rFonts w:ascii="Calibri" w:hAnsi="Calibri" w:eastAsia="Microsoft YaHei"/>
+                <w:sz w:val="18"/>
+              </w:rPr>
+              <w:t>人工判断液氨去向、下游负荷、热电约束和设备护机之间的取舍。</w:t>
+            </w:r>
+          </w:p>
+        </w:tc>
+        <w:tc>
+          <w:tcPr>
+            <w:tcW w:type="dxa" w:w="3528"/>
+            <w:vAlign w:val="center"/>
+            <w:tcMar>
+              <w:top w:w="90" w:type="dxa"/>
+              <w:start w:w="120" w:type="dxa"/>
+              <w:bottom w:w="90" w:type="dxa"/>
+              <w:end w:w="120" w:type="dxa"/>
+            </w:tcMar>
+          </w:tcPr>
+          <w:p>
+            <w:r>
+              <w:rPr>
+                <w:rFonts w:ascii="Calibri" w:hAnsi="Calibri" w:eastAsia="Microsoft YaHei"/>
+                <w:sz w:val="18"/>
+              </w:rPr>
+              <w:t>输出产供销联动三案：保安全、保连续、保贡献，并解释牺牲项和回滚条件。</w:t>
+            </w:r>
+          </w:p>
+        </w:tc>
+        <w:tc>
+          <w:tcPr>
+            <w:tcW w:type="dxa" w:w="1440"/>
+            <w:vAlign w:val="center"/>
+            <w:tcMar>
+              <w:top w:w="90" w:type="dxa"/>
+              <w:start w:w="120" w:type="dxa"/>
+              <w:bottom w:w="90" w:type="dxa"/>
+              <w:end w:w="120" w:type="dxa"/>
+            </w:tcMar>
+          </w:tcPr>
+          <w:p>
+            <w:r>
+              <w:rPr>
+                <w:rFonts w:ascii="Calibri" w:hAnsi="Calibri" w:eastAsia="Microsoft YaHei"/>
+                <w:sz w:val="18"/>
+              </w:rPr>
+              <w:t>降低错失窗口和误判风险。</w:t>
+            </w:r>
+          </w:p>
+        </w:tc>
+      </w:tr>
+      <w:tr>
+        <w:tc>
+          <w:tcPr>
+            <w:tcW w:type="dxa" w:w="1656"/>
+            <w:vAlign w:val="center"/>
+            <w:tcMar>
+              <w:top w:w="90" w:type="dxa"/>
+              <w:start w:w="120" w:type="dxa"/>
+              <w:bottom w:w="90" w:type="dxa"/>
+              <w:end w:w="120" w:type="dxa"/>
+            </w:tcMar>
+          </w:tcPr>
+          <w:p>
+            <w:r>
+              <w:rPr>
+                <w:rFonts w:ascii="Calibri" w:hAnsi="Calibri" w:eastAsia="Microsoft YaHei"/>
+                <w:sz w:val="18"/>
+              </w:rPr>
+              <w:t>复盘沉淀弱</w:t>
+            </w:r>
+          </w:p>
+        </w:tc>
+        <w:tc>
+          <w:tcPr>
+            <w:tcW w:type="dxa" w:w="2592"/>
+            <w:vAlign w:val="center"/>
+            <w:tcMar>
+              <w:top w:w="90" w:type="dxa"/>
+              <w:start w:w="120" w:type="dxa"/>
+              <w:bottom w:w="90" w:type="dxa"/>
+              <w:end w:w="120" w:type="dxa"/>
+            </w:tcMar>
+          </w:tcPr>
+          <w:p>
+            <w:r>
+              <w:rPr>
+                <w:rFonts w:ascii="Calibri" w:hAnsi="Calibri" w:eastAsia="Microsoft YaHei"/>
+                <w:sz w:val="18"/>
+              </w:rPr>
+              <w:t>很多判断停留在口头交接或个人经验里。</w:t>
+            </w:r>
+          </w:p>
+        </w:tc>
+        <w:tc>
+          <w:tcPr>
+            <w:tcW w:type="dxa" w:w="3528"/>
+            <w:vAlign w:val="center"/>
+            <w:tcMar>
+              <w:top w:w="90" w:type="dxa"/>
+              <w:start w:w="120" w:type="dxa"/>
+              <w:bottom w:w="90" w:type="dxa"/>
+              <w:end w:w="120" w:type="dxa"/>
+            </w:tcMar>
+          </w:tcPr>
+          <w:p>
+            <w:r>
+              <w:rPr>
+                <w:rFonts w:ascii="Calibri" w:hAnsi="Calibri" w:eastAsia="Microsoft YaHei"/>
+                <w:sz w:val="18"/>
+              </w:rPr>
+              <w:t>通过飞书任务、审批和Base复盘沉淀为可复用样本。</w:t>
+            </w:r>
+          </w:p>
+        </w:tc>
+        <w:tc>
+          <w:tcPr>
+            <w:tcW w:type="dxa" w:w="1440"/>
+            <w:vAlign w:val="center"/>
+            <w:tcMar>
+              <w:top w:w="90" w:type="dxa"/>
+              <w:start w:w="120" w:type="dxa"/>
+              <w:bottom w:w="90" w:type="dxa"/>
+              <w:end w:w="120" w:type="dxa"/>
+            </w:tcMar>
+          </w:tcPr>
+          <w:p>
+            <w:r>
+              <w:rPr>
+                <w:rFonts w:ascii="Calibri" w:hAnsi="Calibri" w:eastAsia="Microsoft YaHei"/>
+                <w:sz w:val="18"/>
+              </w:rPr>
+              <w:t>形成企业级调度经验资产。</w:t>
+            </w:r>
+          </w:p>
+        </w:tc>
+      </w:tr>
+    </w:tbl>
+    <w:p>
+      <w:pPr>
+        <w:pStyle w:val="Heading1"/>
+      </w:pPr>
+      <w:r>
+        <w:t>8. 产供销经济取舍口径</w:t>
       </w:r>
     </w:p>
     <w:p>
@@ -2602,7 +3063,7 @@
         <w:pStyle w:val="Heading1"/>
       </w:pPr>
       <w:r>
-        <w:t>8. 跨装置联动的调度优先级</w:t>
+        <w:t>9. 跨装置联动的调度优先级</w:t>
       </w:r>
     </w:p>
     <w:p>
@@ -2977,7 +3438,7 @@
         <w:pStyle w:val="Heading1"/>
       </w:pPr>
       <w:r>
-        <w:t>9. 30/60/90天落地路径</w:t>
+        <w:t>10. 30/60/90天落地路径</w:t>
       </w:r>
     </w:p>
     <w:tbl>
@@ -3344,7 +3805,7 @@
         <w:pStyle w:val="Heading1"/>
       </w:pPr>
       <w:r>
-        <w:t>10. 验收与停用条件</w:t>
+        <w:t>11. 验收与停用条件</w:t>
       </w:r>
     </w:p>
     <w:p>

</xml_diff>

<commit_message>
feat: harden enterprise ammonia dispatch workflow
</commit_message>
<xml_diff>
--- a/提交材料/02_整体解决方案书.docx
+++ b/提交材料/02_整体解决方案书.docx
@@ -51,7 +51,7 @@
         <w:pStyle w:val="Heading1"/>
       </w:pPr>
       <w:r>
-        <w:t>2. 决赛主线收束</w:t>
+        <w:t>2. 业务主线</w:t>
       </w:r>
     </w:p>
     <w:tbl>
@@ -668,7 +668,7 @@
                 <w:rFonts w:ascii="Calibri" w:hAnsi="Calibri" w:eastAsia="Microsoft YaHei"/>
                 <w:sz w:val="18"/>
               </w:rPr>
-              <w:t>可信模型</w:t>
+              <w:t>约束与候选模型</w:t>
             </w:r>
           </w:p>
         </w:tc>
@@ -689,7 +689,7 @@
                 <w:rFonts w:ascii="Calibri" w:hAnsi="Calibri" w:eastAsia="Microsoft YaHei"/>
                 <w:sz w:val="18"/>
               </w:rPr>
-              <w:t>机理约束、PINN反应器校准、设备健康预测、库存/订单/行情预测</w:t>
+              <w:t>机理硬约束、设备趋势、库存/订单预测；PINN仅作为待验证的反应器校准候选</w:t>
             </w:r>
           </w:p>
         </w:tc>
@@ -710,7 +710,7 @@
                 <w:rFonts w:ascii="Calibri" w:hAnsi="Calibri" w:eastAsia="Microsoft YaHei"/>
                 <w:sz w:val="18"/>
               </w:rPr>
-              <w:t>模型版本、置信度、漂移监控、回放验证报告</w:t>
+              <w:t>规则版本、适用范围、漂移监控、留出班次回放报告</w:t>
             </w:r>
           </w:p>
         </w:tc>
@@ -924,7 +924,7 @@
         <w:rPr>
           <w:rFonts w:ascii="Calibri" w:hAnsi="Calibri" w:eastAsia="Microsoft YaHei"/>
         </w:rPr>
-        <w:t>企业导师补充了云图现场正在使用或建设中的关键系统。决赛方案据此把AI调控师定位为现有商业软件之上的“跨系统调度编排层”，不重做DCS、MES、APC或压机软件，而是理清各系统主要功能、数据流向和写回边界。</w:t>
+        <w:t>根据企业访谈记录，现场已有或正在建设多套生产与经营系统。平台据此定位为现有商业软件之上的跨系统调度编排层，不重做DCS、MES、APC或压机软件，而是理清各系统主要功能、数据流向和写回边界。</w:t>
       </w:r>
     </w:p>
     <w:tbl>
@@ -1466,7 +1466,7 @@
         <w:rPr>
           <w:rFonts w:ascii="Calibri" w:hAnsi="Calibri" w:eastAsia="Microsoft YaHei"/>
         </w:rPr>
-        <w:t>MES与合成氨调控平台：导师口述合成氨调控平台为“海尔豪斯”，具体厂商名称待企业确认。</w:t>
+        <w:t>MES与合成氨调控平台：企业访谈中记录为“海尔豪斯”调控平台，具体厂商名称待企业确认。</w:t>
       </w:r>
     </w:p>
     <w:p>
@@ -1488,7 +1488,7 @@
         <w:rPr>
           <w:rFonts w:ascii="Calibri" w:hAnsi="Calibri" w:eastAsia="Microsoft YaHei"/>
         </w:rPr>
-        <w:t>合成氨DCS：导师口述为中控体系，具体名称待企业确认。</w:t>
+        <w:t>合成氨DCS：企业访谈中记录为中控体系，具体名称待企业确认。</w:t>
       </w:r>
     </w:p>
     <w:p>
@@ -1510,7 +1510,7 @@
         <w:rPr>
           <w:rFonts w:ascii="Calibri" w:hAnsi="Calibri" w:eastAsia="Microsoft YaHei"/>
         </w:rPr>
-        <w:t>SMC压机软件、康迪森机组数据：导师口述机组数据已接入和利时平台，具体点位清单待企业确认。</w:t>
+        <w:t>SMC压机软件、康迪森机组数据：企业访谈中记录机组数据已接入和利时平台，具体点位清单待企业确认。</w:t>
       </w:r>
     </w:p>
     <w:p>
@@ -2098,7 +2098,7 @@
         <w:rPr>
           <w:rFonts w:ascii="Calibri" w:hAnsi="Calibri" w:eastAsia="Microsoft YaHei"/>
         </w:rPr>
-        <w:t>PINN/机理侧：以合成塔热平衡、反应器温升、氢氮比、循环气量、压缩机效率作为模型约束，避免纯数据模型给出现场不可执行的方案。</w:t>
+        <w:t>机理与模型侧：先以合成塔热平衡、反应器温升、氢氮比、循环气量和压缩机效率形成硬约束；PINN只有完成企业历史回放与留出班次验证后，才可作为影子计算的候选校准方法。</w:t>
       </w:r>
     </w:p>
     <w:p>
@@ -2578,7 +2578,7 @@
         <w:rPr>
           <w:rFonts w:ascii="Calibri" w:hAnsi="Calibri" w:eastAsia="Microsoft YaHei"/>
         </w:rPr>
-        <w:t>企业导师进一步指出，当前MES、DCS、IoT、APC、压机软件、热电平台和经营数据更像多个孤岛。真正困难的不是某一个系统有没有数据，而是调度长需要靠经验从庞大的系统中逐条抽取信息，再把价格、库存、订单、装置负荷、设备状态和公辅约束汇总判断。培养一个成熟调度长往往需要五年甚至更久，这正是AI调控师最应补位的地方。</w:t>
+        <w:t>企业访谈显示，当前MES、DCS、IoT、APC、压机软件、热电平台和经营数据之间仍需人工串联。真正困难的不是某一个系统有没有数据，而是调度长需要从多套系统抽取信息，再把价格、库存、订单、装置负荷、设备状态和公辅约束汇总判断。成熟调度长培养周期可达五年，这正是数字调度长需要补位的地方。</w:t>
       </w:r>
     </w:p>
     <w:tbl>
@@ -3039,7 +3039,7 @@
         <w:rPr>
           <w:rFonts w:ascii="Calibri" w:hAnsi="Calibri" w:eastAsia="Microsoft YaHei"/>
         </w:rPr>
-        <w:t>产供销调度不能简单按“售价高于完全成本才生产”判断。化工连续装置存在折旧、人工、公辅和装置重启等固定或半固定成本，某个下游产品即使短期售价低于完全成本，只要能覆盖变动成本、贡献一部分固定成本、维持流程连续或保障战略订单，也可能仍然值得开；反之，若边际贡献为负且占用稀缺液氨、能源或关键设备能力，则应考虑降负荷或停产。</w:t>
+        <w:t>产供销调度不能简单按“售价高于完全成本才生产”判断。验收账本采用增量口径：产品净收入减非氨变动成本、包装物流、液氨机会成本和启停摊销，再加可核验的违约避免额。折旧、固定人工等只作为管理解释，不重复加入增量贡献。若贡献为负且占用稀缺液氨、能源或关键设备能力，则进入降负荷或停产评估。</w:t>
       </w:r>
     </w:p>
     <w:tbl>
@@ -3354,7 +3354,7 @@
                 <w:rFonts w:ascii="Calibri" w:hAnsi="Calibri" w:eastAsia="Microsoft YaHei"/>
                 <w:sz w:val="18"/>
               </w:rPr>
-              <w:t>连续开车带走折旧、固定人工、装置维持费用和部分公辅摊销。</w:t>
+              <w:t>连续开车可能覆盖部分折旧、固定人工和装置维持费用。</w:t>
             </w:r>
           </w:p>
         </w:tc>
@@ -3375,7 +3375,7 @@
                 <w:rFonts w:ascii="Calibri" w:hAnsi="Calibri" w:eastAsia="Microsoft YaHei"/>
                 <w:sz w:val="18"/>
               </w:rPr>
-              <w:t>避免把短期账面亏损误判为必须停产。</w:t>
+              <w:t>作为管理层解释单列展示，不再计入增量贡献，避免重复核算。</w:t>
             </w:r>
           </w:p>
         </w:tc>
@@ -3524,7 +3524,7 @@
         <w:rPr>
           <w:rFonts w:ascii="Calibri" w:hAnsi="Calibri" w:eastAsia="Microsoft YaHei"/>
         </w:rPr>
-        <w:t>企业导师补充的关键现场经验是：合成氨调度不能只看当班利润，必须先保安全，再保流程连续，只有在流程确实需要中断时才进入特殊取舍。DCS可以完成液位、阀门、局部顺控和联锁保护，但难以自动判断下游异常、气区设备、能源窗口和产品结构变化后的跨大单元联动，因此本方案把这部分做成AI调控师的规则层。</w:t>
+        <w:t>企业访谈确认：合成氨调度不能只看当班利润，必须先保安全，再保流程连续，只有在流程确实需要中断时才进入特殊取舍。DCS可以完成液位、阀门、局部顺控和联锁保护，但难以自动判断下游异常、气区设备、能源窗口和产品结构变化后的跨大单元联动，因此本方案把这部分做成调控师的规则层。</w:t>
       </w:r>
     </w:p>
     <w:tbl>
@@ -3838,7 +3838,7 @@
                 <w:rFonts w:ascii="Calibri" w:hAnsi="Calibri" w:eastAsia="Microsoft YaHei"/>
                 <w:sz w:val="18"/>
               </w:rPr>
-              <w:t>流程确需中断时，比较停空分、停合成气轮机或停下游装置的代价。</w:t>
+              <w:t>流程确需中断时，比较空分、合成气轮机驱动系统与下游装置的停运代价。</w:t>
             </w:r>
           </w:p>
         </w:tc>
@@ -3859,7 +3859,7 @@
                 <w:rFonts w:ascii="Calibri" w:hAnsi="Calibri" w:eastAsia="Microsoft YaHei"/>
                 <w:sz w:val="18"/>
               </w:rPr>
-              <w:t>按安全、重启复杂度、废料损失、对主流程影响排序；已验证同类场景优先保气轮机驱动关键系统，停空分方案需班长/主管确认。</w:t>
+              <w:t>按安全、重启复杂度、废料损失和主流程影响排序；企业口述案例仅作为待复核候选，不固化为通用停机规则。</w:t>
             </w:r>
           </w:p>
         </w:tc>
@@ -3880,7 +3880,7 @@
                 <w:rFonts w:ascii="Calibri" w:hAnsi="Calibri" w:eastAsia="Microsoft YaHei"/>
                 <w:sz w:val="18"/>
               </w:rPr>
-              <w:t>作为专家规则，不做前端自动执行；每次结果回写知识库。</w:t>
+              <w:t>由班长、调度主管和相关专业会签；平台不自动执行停机。</w:t>
             </w:r>
           </w:p>
         </w:tc>
@@ -4033,7 +4033,7 @@
                 <w:rFonts w:ascii="Calibri" w:hAnsi="Calibri" w:eastAsia="Microsoft YaHei"/>
                 <w:sz w:val="18"/>
               </w:rPr>
-              <w:t>统一数据口径和班次事实表</w:t>
+              <w:t>完成首批四类数据口径</w:t>
             </w:r>
           </w:p>
         </w:tc>
@@ -4054,7 +4054,7 @@
                 <w:rFonts w:ascii="Calibri" w:hAnsi="Calibri" w:eastAsia="Microsoft YaHei"/>
                 <w:sz w:val="18"/>
               </w:rPr>
-              <w:t>接口清单、字段字典、数据质量报告、飞书协同草案</w:t>
+              <w:t>ERP订单导出、MES班次计划、罐区历史摘要、飞书协同记录的字段字典与质量报告</w:t>
             </w:r>
           </w:p>
         </w:tc>
@@ -4075,7 +4075,7 @@
                 <w:rFonts w:ascii="Calibri" w:hAnsi="Calibri" w:eastAsia="Microsoft YaHei"/>
                 <w:sz w:val="18"/>
               </w:rPr>
-              <w:t>关键字段完整、调度员能核对口径。</w:t>
+              <w:t>调度员能逐字段核对来源、时间戳、质量码和责任专业。</w:t>
             </w:r>
           </w:p>
         </w:tc>

</xml_diff>